<commit_message>
docs: done report 2
</commit_message>
<xml_diff>
--- a/reports/звіт 2....docx
+++ b/reports/звіт 2....docx
@@ -895,7 +895,16 @@
           <w:szCs w:val="28"/>
         </w:rPr>
         <w:lastRenderedPageBreak/>
-        <w:t xml:space="preserve">Мета: </w:t>
+        <w:t>Ме</w:t>
+      </w:r>
+      <w:r>
+        <w:rPr>
+          <w:rFonts w:ascii="Times New Roman" w:hAnsi="Times New Roman" w:cs="Times New Roman"/>
+          <w:bCs/>
+          <w:sz w:val="28"/>
+          <w:szCs w:val="28"/>
+        </w:rPr>
+        <w:t xml:space="preserve">та: </w:t>
       </w:r>
       <w:proofErr w:type="spellStart"/>
       <w:r>
@@ -1045,45 +1054,104 @@
         <w:t>Хід роботи</w:t>
       </w:r>
     </w:p>
-    <w:p/>
-    <w:p>
-      <w:r>
+    <w:p>
+      <w:pPr>
+        <w:rPr>
+          <w:rFonts w:ascii="Times New Roman" w:hAnsi="Times New Roman" w:cs="Times New Roman"/>
+          <w:sz w:val="28"/>
+          <w:szCs w:val="28"/>
+        </w:rPr>
+      </w:pPr>
+    </w:p>
+    <w:p>
+      <w:pPr>
+        <w:rPr>
+          <w:rFonts w:ascii="Times New Roman" w:hAnsi="Times New Roman" w:cs="Times New Roman"/>
+          <w:sz w:val="28"/>
+          <w:szCs w:val="28"/>
+        </w:rPr>
+      </w:pPr>
+      <w:r>
+        <w:rPr>
+          <w:rFonts w:ascii="Times New Roman" w:hAnsi="Times New Roman" w:cs="Times New Roman"/>
+          <w:sz w:val="28"/>
+          <w:szCs w:val="28"/>
+        </w:rPr>
         <w:tab/>
         <w:t xml:space="preserve">Вивчаю теоретичні відомості, переглядаю </w:t>
       </w:r>
       <w:proofErr w:type="spellStart"/>
       <w:r>
+        <w:rPr>
+          <w:rFonts w:ascii="Times New Roman" w:hAnsi="Times New Roman" w:cs="Times New Roman"/>
+          <w:sz w:val="28"/>
+          <w:szCs w:val="28"/>
+        </w:rPr>
         <w:t>туторіали</w:t>
       </w:r>
       <w:proofErr w:type="spellEnd"/>
       <w:r>
+        <w:rPr>
+          <w:rFonts w:ascii="Times New Roman" w:hAnsi="Times New Roman" w:cs="Times New Roman"/>
+          <w:sz w:val="28"/>
+          <w:szCs w:val="28"/>
+        </w:rPr>
         <w:t xml:space="preserve"> для створення додатка на основі </w:t>
       </w:r>
       <w:r>
         <w:rPr>
+          <w:rFonts w:ascii="Times New Roman" w:hAnsi="Times New Roman" w:cs="Times New Roman"/>
+          <w:sz w:val="28"/>
+          <w:szCs w:val="28"/>
           <w:lang w:val="en-US"/>
         </w:rPr>
         <w:t>WPF.</w:t>
       </w:r>
       <w:r>
+        <w:rPr>
+          <w:rFonts w:ascii="Times New Roman" w:hAnsi="Times New Roman" w:cs="Times New Roman"/>
+          <w:sz w:val="28"/>
+          <w:szCs w:val="28"/>
+        </w:rPr>
         <w:t xml:space="preserve"> Розробляю консольну програму для обчислення суми.</w:t>
       </w:r>
       <w:r>
+        <w:rPr>
+          <w:rFonts w:ascii="Times New Roman" w:hAnsi="Times New Roman" w:cs="Times New Roman"/>
+          <w:sz w:val="28"/>
+          <w:szCs w:val="28"/>
+        </w:rPr>
         <w:t xml:space="preserve"> На рисунку 2.1 продемонстровано варіант завдання.</w:t>
       </w:r>
     </w:p>
-    <w:p/>
-    <w:p>
-      <w:pPr>
-        <w:rPr>
+    <w:p>
+      <w:pPr>
+        <w:rPr>
+          <w:rFonts w:ascii="Times New Roman" w:hAnsi="Times New Roman" w:cs="Times New Roman"/>
+          <w:sz w:val="28"/>
+          <w:szCs w:val="28"/>
+        </w:rPr>
+      </w:pPr>
+    </w:p>
+    <w:p>
+      <w:pPr>
+        <w:jc w:val="center"/>
+        <w:rPr>
+          <w:rFonts w:ascii="Times New Roman" w:hAnsi="Times New Roman" w:cs="Times New Roman"/>
           <w:b/>
           <w:bCs/>
-        </w:rPr>
-      </w:pPr>
-      <w:r>
-        <w:rPr>
+          <w:sz w:val="28"/>
+          <w:szCs w:val="28"/>
+        </w:rPr>
+      </w:pPr>
+      <w:r>
+        <w:rPr>
+          <w:rFonts w:ascii="Times New Roman" w:hAnsi="Times New Roman" w:cs="Times New Roman"/>
           <w:b/>
           <w:bCs/>
+          <w:noProof/>
+          <w:sz w:val="28"/>
+          <w:szCs w:val="28"/>
         </w:rPr>
         <w:drawing>
           <wp:inline distT="0" distB="0" distL="0" distR="0" wp14:anchorId="3FDE50A7" wp14:editId="4EC8EBDC">
@@ -1124,33 +1192,81 @@
     </w:p>
     <w:p>
       <w:pPr>
-        <w:rPr>
+        <w:jc w:val="center"/>
+        <w:rPr>
+          <w:rFonts w:ascii="Times New Roman" w:hAnsi="Times New Roman" w:cs="Times New Roman"/>
+          <w:sz w:val="28"/>
+          <w:szCs w:val="28"/>
+        </w:rPr>
+      </w:pPr>
+      <w:r>
+        <w:rPr>
+          <w:rFonts w:ascii="Times New Roman" w:hAnsi="Times New Roman" w:cs="Times New Roman"/>
+          <w:sz w:val="28"/>
+          <w:szCs w:val="28"/>
+        </w:rPr>
+        <w:t>Рисунок 2.1 – Варіант завдання</w:t>
+      </w:r>
+    </w:p>
+    <w:p>
+      <w:pPr>
+        <w:jc w:val="center"/>
+        <w:rPr>
+          <w:rFonts w:ascii="Times New Roman" w:hAnsi="Times New Roman" w:cs="Times New Roman"/>
+          <w:sz w:val="28"/>
+          <w:szCs w:val="28"/>
+        </w:rPr>
+      </w:pPr>
+    </w:p>
+    <w:p>
+      <w:pPr>
+        <w:ind w:firstLine="708"/>
+        <w:rPr>
+          <w:rFonts w:ascii="Times New Roman" w:hAnsi="Times New Roman" w:cs="Times New Roman"/>
+          <w:sz w:val="28"/>
+          <w:szCs w:val="28"/>
+        </w:rPr>
+      </w:pPr>
+      <w:r>
+        <w:rPr>
+          <w:rFonts w:ascii="Times New Roman" w:hAnsi="Times New Roman" w:cs="Times New Roman"/>
+          <w:sz w:val="28"/>
+          <w:szCs w:val="28"/>
+        </w:rPr>
+        <w:t>Результат виконання програми продемонстровано на рисунку 2.2.</w:t>
+      </w:r>
+    </w:p>
+    <w:p>
+      <w:pPr>
+        <w:rPr>
+          <w:rFonts w:ascii="Times New Roman" w:hAnsi="Times New Roman" w:cs="Times New Roman"/>
           <w:b/>
           <w:bCs/>
-        </w:rPr>
-      </w:pPr>
-      <w:r>
-        <w:t xml:space="preserve">Результат виконання </w:t>
-      </w:r>
-      <w:r>
-        <w:t xml:space="preserve">програми </w:t>
-      </w:r>
-      <w:r>
-        <w:t>продемонстровано на рисунку 2.</w:t>
-      </w:r>
-      <w:r>
-        <w:t>2</w:t>
-      </w:r>
-      <w:r>
-        <w:t>.</w:t>
-      </w:r>
-    </w:p>
-    <w:p>
-      <w:r>
+          <w:sz w:val="28"/>
+          <w:szCs w:val="28"/>
+        </w:rPr>
+      </w:pPr>
+    </w:p>
+    <w:p>
+      <w:pPr>
+        <w:jc w:val="center"/>
+        <w:rPr>
+          <w:rFonts w:ascii="Times New Roman" w:hAnsi="Times New Roman" w:cs="Times New Roman"/>
+          <w:sz w:val="28"/>
+          <w:szCs w:val="28"/>
+        </w:rPr>
+      </w:pPr>
+      <w:r>
+        <w:rPr>
+          <w:rFonts w:ascii="Times New Roman" w:hAnsi="Times New Roman" w:cs="Times New Roman"/>
+          <w:noProof/>
+          <w:sz w:val="28"/>
+          <w:szCs w:val="28"/>
+        </w:rPr>
         <w:drawing>
-          <wp:inline distT="0" distB="0" distL="0" distR="0" wp14:anchorId="24C4F118" wp14:editId="3261E58F">
-            <wp:extent cx="3553321" cy="1895740"/>
-            <wp:effectExtent l="0" t="0" r="0" b="9525"/>
+          <wp:inline distT="0" distB="0" distL="0" distR="0" wp14:anchorId="24C4F118" wp14:editId="11EA79E7">
+            <wp:extent cx="4233395" cy="2258568"/>
+            <wp:effectExtent l="0" t="0" r="0" b="8890"/>
             <wp:docPr id="2" name="Рисунок 2"/>
             <wp:cNvGraphicFramePr>
               <a:graphicFrameLocks xmlns:a="http://schemas.openxmlformats.org/drawingml/2006/main" noChangeAspect="1"/>
@@ -1171,7 +1287,7 @@
                   <pic:spPr>
                     <a:xfrm>
                       <a:off x="0" y="0"/>
-                      <a:ext cx="3553321" cy="1895740"/>
+                      <a:ext cx="4257509" cy="2271433"/>
                     </a:xfrm>
                     <a:prstGeom prst="rect">
                       <a:avLst/>
@@ -1185,25 +1301,113 @@
       </w:r>
     </w:p>
     <w:p>
-      <w:r>
+      <w:pPr>
+        <w:jc w:val="center"/>
+        <w:rPr>
+          <w:rFonts w:ascii="Times New Roman" w:hAnsi="Times New Roman" w:cs="Times New Roman"/>
+          <w:sz w:val="28"/>
+          <w:szCs w:val="28"/>
+        </w:rPr>
+      </w:pPr>
+      <w:r>
+        <w:rPr>
+          <w:rFonts w:ascii="Times New Roman" w:hAnsi="Times New Roman" w:cs="Times New Roman"/>
+          <w:sz w:val="28"/>
+          <w:szCs w:val="28"/>
+        </w:rPr>
+        <w:t>Рисунок 2.</w:t>
+      </w:r>
+      <w:r>
+        <w:rPr>
+          <w:rFonts w:ascii="Times New Roman" w:hAnsi="Times New Roman" w:cs="Times New Roman"/>
+          <w:sz w:val="28"/>
+          <w:szCs w:val="28"/>
+        </w:rPr>
+        <w:t>2</w:t>
+      </w:r>
+      <w:r>
+        <w:rPr>
+          <w:rFonts w:ascii="Times New Roman" w:hAnsi="Times New Roman" w:cs="Times New Roman"/>
+          <w:sz w:val="28"/>
+          <w:szCs w:val="28"/>
+        </w:rPr>
+        <w:t xml:space="preserve"> </w:t>
+      </w:r>
+      <w:r>
+        <w:rPr>
+          <w:rFonts w:ascii="Times New Roman" w:hAnsi="Times New Roman" w:cs="Times New Roman"/>
+          <w:sz w:val="28"/>
+          <w:szCs w:val="28"/>
+        </w:rPr>
+        <w:t>– Результат виконання програми</w:t>
+      </w:r>
+    </w:p>
+    <w:p>
+      <w:pPr>
+        <w:ind w:firstLine="708"/>
+        <w:rPr>
+          <w:rFonts w:ascii="Times New Roman" w:hAnsi="Times New Roman" w:cs="Times New Roman"/>
+          <w:sz w:val="28"/>
+          <w:szCs w:val="28"/>
+        </w:rPr>
+      </w:pPr>
+      <w:r>
+        <w:rPr>
+          <w:rFonts w:ascii="Times New Roman" w:hAnsi="Times New Roman" w:cs="Times New Roman"/>
+          <w:sz w:val="28"/>
+          <w:szCs w:val="28"/>
+        </w:rPr>
+        <w:lastRenderedPageBreak/>
         <w:t>Якщо ввести не числове значення для х, у або</w:t>
       </w:r>
       <w:r>
         <w:rPr>
+          <w:rFonts w:ascii="Times New Roman" w:hAnsi="Times New Roman" w:cs="Times New Roman"/>
+          <w:sz w:val="28"/>
+          <w:szCs w:val="28"/>
           <w:lang w:val="en-US"/>
         </w:rPr>
         <w:t xml:space="preserve"> z</w:t>
       </w:r>
       <w:r>
+        <w:rPr>
+          <w:rFonts w:ascii="Times New Roman" w:hAnsi="Times New Roman" w:cs="Times New Roman"/>
+          <w:sz w:val="28"/>
+          <w:szCs w:val="28"/>
+        </w:rPr>
         <w:t>, то отримаємо помилку, подану на рисунку 2.3.</w:t>
       </w:r>
     </w:p>
     <w:p>
-      <w:r>
+      <w:pPr>
+        <w:ind w:firstLine="708"/>
+        <w:rPr>
+          <w:rFonts w:ascii="Times New Roman" w:hAnsi="Times New Roman" w:cs="Times New Roman"/>
+          <w:sz w:val="28"/>
+          <w:szCs w:val="28"/>
+        </w:rPr>
+      </w:pPr>
+    </w:p>
+    <w:p>
+      <w:pPr>
+        <w:jc w:val="center"/>
+        <w:rPr>
+          <w:rFonts w:ascii="Times New Roman" w:hAnsi="Times New Roman" w:cs="Times New Roman"/>
+          <w:sz w:val="28"/>
+          <w:szCs w:val="28"/>
+        </w:rPr>
+      </w:pPr>
+      <w:r>
+        <w:rPr>
+          <w:rFonts w:ascii="Times New Roman" w:hAnsi="Times New Roman" w:cs="Times New Roman"/>
+          <w:noProof/>
+          <w:sz w:val="28"/>
+          <w:szCs w:val="28"/>
+        </w:rPr>
         <w:drawing>
-          <wp:inline distT="0" distB="0" distL="0" distR="0" wp14:anchorId="69775986" wp14:editId="22B2549B">
-            <wp:extent cx="3572374" cy="1609950"/>
-            <wp:effectExtent l="0" t="0" r="9525" b="9525"/>
+          <wp:inline distT="0" distB="0" distL="0" distR="0" wp14:anchorId="69775986" wp14:editId="4D4E2682">
+            <wp:extent cx="4443497" cy="2002536"/>
+            <wp:effectExtent l="0" t="0" r="0" b="0"/>
             <wp:docPr id="3" name="Рисунок 3"/>
             <wp:cNvGraphicFramePr>
               <a:graphicFrameLocks xmlns:a="http://schemas.openxmlformats.org/drawingml/2006/main" noChangeAspect="1"/>
@@ -1224,7 +1428,7 @@
                   <pic:spPr>
                     <a:xfrm>
                       <a:off x="0" y="0"/>
-                      <a:ext cx="3572374" cy="1609950"/>
+                      <a:ext cx="4452281" cy="2006495"/>
                     </a:xfrm>
                     <a:prstGeom prst="rect">
                       <a:avLst/>
@@ -1238,35 +1442,156 @@
       </w:r>
     </w:p>
     <w:p>
-      <w:r>
-        <w:lastRenderedPageBreak/>
+      <w:pPr>
+        <w:jc w:val="center"/>
+        <w:rPr>
+          <w:rFonts w:ascii="Times New Roman" w:hAnsi="Times New Roman" w:cs="Times New Roman"/>
+          <w:sz w:val="28"/>
+          <w:szCs w:val="28"/>
+        </w:rPr>
+      </w:pPr>
+      <w:r>
+        <w:rPr>
+          <w:rFonts w:ascii="Times New Roman" w:hAnsi="Times New Roman" w:cs="Times New Roman"/>
+          <w:sz w:val="28"/>
+          <w:szCs w:val="28"/>
+        </w:rPr>
+        <w:t>Рисунок 2.</w:t>
+      </w:r>
+      <w:r>
+        <w:rPr>
+          <w:rFonts w:ascii="Times New Roman" w:hAnsi="Times New Roman" w:cs="Times New Roman"/>
+          <w:sz w:val="28"/>
+          <w:szCs w:val="28"/>
+        </w:rPr>
+        <w:t>3</w:t>
+      </w:r>
+      <w:r>
+        <w:rPr>
+          <w:rFonts w:ascii="Times New Roman" w:hAnsi="Times New Roman" w:cs="Times New Roman"/>
+          <w:sz w:val="28"/>
+          <w:szCs w:val="28"/>
+        </w:rPr>
+        <w:t xml:space="preserve"> </w:t>
+      </w:r>
+      <w:r>
+        <w:rPr>
+          <w:rFonts w:ascii="Times New Roman" w:hAnsi="Times New Roman" w:cs="Times New Roman"/>
+          <w:sz w:val="28"/>
+          <w:szCs w:val="28"/>
+        </w:rPr>
+        <w:t>–</w:t>
+      </w:r>
+      <w:r>
+        <w:rPr>
+          <w:rFonts w:ascii="Times New Roman" w:hAnsi="Times New Roman" w:cs="Times New Roman"/>
+          <w:sz w:val="28"/>
+          <w:szCs w:val="28"/>
+        </w:rPr>
+        <w:t xml:space="preserve"> </w:t>
+      </w:r>
+      <w:r>
+        <w:rPr>
+          <w:rFonts w:ascii="Times New Roman" w:hAnsi="Times New Roman" w:cs="Times New Roman"/>
+          <w:sz w:val="28"/>
+          <w:szCs w:val="28"/>
+        </w:rPr>
+        <w:t>Приклад помилки</w:t>
+      </w:r>
+    </w:p>
+    <w:p>
+      <w:pPr>
+        <w:rPr>
+          <w:rFonts w:ascii="Times New Roman" w:hAnsi="Times New Roman" w:cs="Times New Roman"/>
+          <w:sz w:val="28"/>
+          <w:szCs w:val="28"/>
+        </w:rPr>
+      </w:pPr>
+    </w:p>
+    <w:p>
+      <w:pPr>
+        <w:ind w:firstLine="708"/>
+        <w:jc w:val="both"/>
+        <w:rPr>
+          <w:rFonts w:ascii="Times New Roman" w:hAnsi="Times New Roman" w:cs="Times New Roman"/>
+          <w:sz w:val="28"/>
+          <w:szCs w:val="28"/>
+        </w:rPr>
+      </w:pPr>
+      <w:r>
+        <w:rPr>
+          <w:rFonts w:ascii="Times New Roman" w:hAnsi="Times New Roman" w:cs="Times New Roman"/>
+          <w:sz w:val="28"/>
+          <w:szCs w:val="28"/>
+        </w:rPr>
         <w:t xml:space="preserve">За означенням </w:t>
       </w:r>
       <w:r>
         <w:rPr>
+          <w:rFonts w:ascii="Times New Roman" w:hAnsi="Times New Roman" w:cs="Times New Roman"/>
+          <w:sz w:val="28"/>
+          <w:szCs w:val="28"/>
           <w:lang w:val="en-US"/>
         </w:rPr>
         <w:t>ln</w:t>
       </w:r>
       <w:r>
+        <w:rPr>
+          <w:rFonts w:ascii="Times New Roman" w:hAnsi="Times New Roman" w:cs="Times New Roman"/>
+          <w:sz w:val="28"/>
+          <w:szCs w:val="28"/>
+        </w:rPr>
         <w:t xml:space="preserve">, </w:t>
       </w:r>
       <w:r>
         <w:rPr>
+          <w:rFonts w:ascii="Times New Roman" w:hAnsi="Times New Roman" w:cs="Times New Roman"/>
+          <w:sz w:val="28"/>
+          <w:szCs w:val="28"/>
           <w:lang w:val="en-US"/>
         </w:rPr>
         <w:t xml:space="preserve">z </w:t>
       </w:r>
       <w:r>
+        <w:rPr>
+          <w:rFonts w:ascii="Times New Roman" w:hAnsi="Times New Roman" w:cs="Times New Roman"/>
+          <w:sz w:val="28"/>
+          <w:szCs w:val="28"/>
+        </w:rPr>
         <w:t>має бути більше 0, якщо користувач не дотримається цієї умови, то отримає повідомлення подане на рисунку 2.4.</w:t>
       </w:r>
     </w:p>
     <w:p>
-      <w:r>
+      <w:pPr>
+        <w:ind w:firstLine="708"/>
+        <w:jc w:val="both"/>
+        <w:rPr>
+          <w:rFonts w:ascii="Times New Roman" w:hAnsi="Times New Roman" w:cs="Times New Roman"/>
+          <w:sz w:val="28"/>
+          <w:szCs w:val="28"/>
+        </w:rPr>
+      </w:pPr>
+    </w:p>
+    <w:p>
+      <w:pPr>
+        <w:jc w:val="center"/>
+        <w:rPr>
+          <w:rFonts w:ascii="Times New Roman" w:hAnsi="Times New Roman" w:cs="Times New Roman"/>
+          <w:sz w:val="28"/>
+          <w:szCs w:val="28"/>
+        </w:rPr>
+      </w:pPr>
+      <w:r>
+        <w:rPr>
+          <w:rFonts w:ascii="Times New Roman" w:hAnsi="Times New Roman" w:cs="Times New Roman"/>
+          <w:noProof/>
+          <w:sz w:val="28"/>
+          <w:szCs w:val="28"/>
+        </w:rPr>
         <w:drawing>
-          <wp:inline distT="0" distB="0" distL="0" distR="0" wp14:anchorId="59D35F6F" wp14:editId="1D011977">
-            <wp:extent cx="3715268" cy="1886213"/>
-            <wp:effectExtent l="0" t="0" r="0" b="0"/>
+          <wp:inline distT="0" distB="0" distL="0" distR="0" wp14:anchorId="59D35F6F" wp14:editId="675B9FAA">
+            <wp:extent cx="4484716" cy="2276856"/>
+            <wp:effectExtent l="0" t="0" r="0" b="9525"/>
             <wp:docPr id="1" name="Рисунок 1"/>
             <wp:cNvGraphicFramePr>
               <a:graphicFrameLocks xmlns:a="http://schemas.openxmlformats.org/drawingml/2006/main" noChangeAspect="1"/>
@@ -1287,7 +1612,7 @@
                   <pic:spPr>
                     <a:xfrm>
                       <a:off x="0" y="0"/>
-                      <a:ext cx="3715268" cy="1886213"/>
+                      <a:ext cx="4489198" cy="2279131"/>
                     </a:xfrm>
                     <a:prstGeom prst="rect">
                       <a:avLst/>
@@ -1301,24 +1626,130 @@
       </w:r>
     </w:p>
     <w:p>
-      <w:r>
+      <w:pPr>
+        <w:jc w:val="center"/>
+        <w:rPr>
+          <w:rFonts w:ascii="Times New Roman" w:hAnsi="Times New Roman" w:cs="Times New Roman"/>
+          <w:sz w:val="28"/>
+          <w:szCs w:val="28"/>
+        </w:rPr>
+      </w:pPr>
+      <w:r>
+        <w:rPr>
+          <w:rFonts w:ascii="Times New Roman" w:hAnsi="Times New Roman" w:cs="Times New Roman"/>
+          <w:sz w:val="28"/>
+          <w:szCs w:val="28"/>
+        </w:rPr>
+        <w:t>Рисунок 2.</w:t>
+      </w:r>
+      <w:r>
+        <w:rPr>
+          <w:rFonts w:ascii="Times New Roman" w:hAnsi="Times New Roman" w:cs="Times New Roman"/>
+          <w:sz w:val="28"/>
+          <w:szCs w:val="28"/>
+        </w:rPr>
+        <w:t>4</w:t>
+      </w:r>
+      <w:r>
+        <w:rPr>
+          <w:rFonts w:ascii="Times New Roman" w:hAnsi="Times New Roman" w:cs="Times New Roman"/>
+          <w:sz w:val="28"/>
+          <w:szCs w:val="28"/>
+        </w:rPr>
+        <w:t xml:space="preserve"> </w:t>
+      </w:r>
+      <w:r>
+        <w:rPr>
+          <w:rFonts w:ascii="Times New Roman" w:hAnsi="Times New Roman" w:cs="Times New Roman"/>
+          <w:sz w:val="28"/>
+          <w:szCs w:val="28"/>
+        </w:rPr>
+        <w:t>– Приклад помилки</w:t>
+      </w:r>
+    </w:p>
+    <w:p>
+      <w:pPr>
+        <w:rPr>
+          <w:rFonts w:ascii="Times New Roman" w:hAnsi="Times New Roman" w:cs="Times New Roman"/>
+          <w:sz w:val="28"/>
+          <w:szCs w:val="28"/>
+        </w:rPr>
+      </w:pPr>
+    </w:p>
+    <w:p>
+      <w:pPr>
+        <w:ind w:firstLine="708"/>
+        <w:jc w:val="both"/>
+        <w:rPr>
+          <w:rFonts w:ascii="Times New Roman" w:hAnsi="Times New Roman" w:cs="Times New Roman"/>
+          <w:sz w:val="28"/>
+          <w:szCs w:val="28"/>
+        </w:rPr>
+      </w:pPr>
+      <w:r>
+        <w:rPr>
+          <w:rFonts w:ascii="Times New Roman" w:hAnsi="Times New Roman" w:cs="Times New Roman"/>
+          <w:sz w:val="28"/>
+          <w:szCs w:val="28"/>
+        </w:rPr>
         <w:t xml:space="preserve">Таку ж саму програму розроблено з використанням </w:t>
       </w:r>
       <w:r>
         <w:rPr>
+          <w:rFonts w:ascii="Times New Roman" w:hAnsi="Times New Roman" w:cs="Times New Roman"/>
+          <w:sz w:val="28"/>
+          <w:szCs w:val="28"/>
           <w:lang w:val="en-US"/>
         </w:rPr>
         <w:t>WPF.</w:t>
       </w:r>
       <w:r>
-        <w:t xml:space="preserve"> Результат виконання продемонстровано на рисунку 2.5.</w:t>
-      </w:r>
-    </w:p>
-    <w:p>
-      <w:r>
+        <w:rPr>
+          <w:rFonts w:ascii="Times New Roman" w:hAnsi="Times New Roman" w:cs="Times New Roman"/>
+          <w:sz w:val="28"/>
+          <w:szCs w:val="28"/>
+        </w:rPr>
+        <w:t xml:space="preserve"> Результат виконання</w:t>
+      </w:r>
+      <w:r>
+        <w:rPr>
+          <w:rFonts w:ascii="Times New Roman" w:hAnsi="Times New Roman" w:cs="Times New Roman"/>
+          <w:sz w:val="28"/>
+          <w:szCs w:val="28"/>
+          <w:lang w:val="en-US"/>
+        </w:rPr>
+        <w:t xml:space="preserve"> </w:t>
+      </w:r>
+      <w:r>
+        <w:rPr>
+          <w:rFonts w:ascii="Times New Roman" w:hAnsi="Times New Roman" w:cs="Times New Roman"/>
+          <w:sz w:val="28"/>
+          <w:szCs w:val="28"/>
+        </w:rPr>
+        <w:t>продемонстровано на рисунку 2.5</w:t>
+      </w:r>
+    </w:p>
+    <w:p>
+      <w:pPr>
+        <w:ind w:firstLine="708"/>
+        <w:jc w:val="center"/>
+        <w:rPr>
+          <w:rFonts w:ascii="Times New Roman" w:hAnsi="Times New Roman" w:cs="Times New Roman"/>
+          <w:sz w:val="28"/>
+          <w:szCs w:val="28"/>
+        </w:rPr>
+      </w:pPr>
+      <w:r>
+        <w:rPr>
+          <w:rFonts w:ascii="Times New Roman" w:hAnsi="Times New Roman" w:cs="Times New Roman"/>
+          <w:noProof/>
+          <w:sz w:val="28"/>
+          <w:szCs w:val="28"/>
+        </w:rPr>
+        <w:lastRenderedPageBreak/>
         <w:drawing>
-          <wp:inline distT="0" distB="0" distL="0" distR="0" wp14:anchorId="746DF29C" wp14:editId="3901300D">
-            <wp:extent cx="5334744" cy="3524742"/>
+          <wp:inline distT="0" distB="0" distL="0" distR="0" wp14:anchorId="746DF29C" wp14:editId="1CBE1E03">
+            <wp:extent cx="4996083" cy="3300984"/>
             <wp:effectExtent l="0" t="0" r="0" b="0"/>
             <wp:docPr id="5" name="Рисунок 5"/>
             <wp:cNvGraphicFramePr>
@@ -1340,7 +1771,7 @@
                   <pic:spPr>
                     <a:xfrm>
                       <a:off x="0" y="0"/>
-                      <a:ext cx="5334744" cy="3524742"/>
+                      <a:ext cx="5004162" cy="3306322"/>
                     </a:xfrm>
                     <a:prstGeom prst="rect">
                       <a:avLst/>
@@ -1354,17 +1785,103 @@
       </w:r>
     </w:p>
     <w:p>
-      <w:r>
+      <w:pPr>
+        <w:ind w:firstLine="708"/>
+        <w:jc w:val="center"/>
+        <w:rPr>
+          <w:rFonts w:ascii="Times New Roman" w:hAnsi="Times New Roman" w:cs="Times New Roman"/>
+          <w:sz w:val="28"/>
+          <w:szCs w:val="28"/>
+        </w:rPr>
+      </w:pPr>
+      <w:r>
+        <w:rPr>
+          <w:rFonts w:ascii="Times New Roman" w:hAnsi="Times New Roman" w:cs="Times New Roman"/>
+          <w:sz w:val="28"/>
+          <w:szCs w:val="28"/>
+        </w:rPr>
+        <w:t>Рисунок 2.</w:t>
+      </w:r>
+      <w:r>
+        <w:rPr>
+          <w:rFonts w:ascii="Times New Roman" w:hAnsi="Times New Roman" w:cs="Times New Roman"/>
+          <w:sz w:val="28"/>
+          <w:szCs w:val="28"/>
+        </w:rPr>
+        <w:t>5</w:t>
+      </w:r>
+      <w:r>
+        <w:rPr>
+          <w:rFonts w:ascii="Times New Roman" w:hAnsi="Times New Roman" w:cs="Times New Roman"/>
+          <w:sz w:val="28"/>
+          <w:szCs w:val="28"/>
+        </w:rPr>
+        <w:t xml:space="preserve"> </w:t>
+      </w:r>
+      <w:r>
+        <w:rPr>
+          <w:rFonts w:ascii="Times New Roman" w:hAnsi="Times New Roman" w:cs="Times New Roman"/>
+          <w:sz w:val="28"/>
+          <w:szCs w:val="28"/>
+        </w:rPr>
+        <w:t>– Результат виконання програми</w:t>
+      </w:r>
+    </w:p>
+    <w:p>
+      <w:pPr>
+        <w:rPr>
+          <w:rFonts w:ascii="Times New Roman" w:hAnsi="Times New Roman" w:cs="Times New Roman"/>
+          <w:sz w:val="28"/>
+          <w:szCs w:val="28"/>
+        </w:rPr>
+      </w:pPr>
+    </w:p>
+    <w:p>
+      <w:pPr>
+        <w:ind w:firstLine="708"/>
+        <w:rPr>
+          <w:rFonts w:ascii="Times New Roman" w:hAnsi="Times New Roman" w:cs="Times New Roman"/>
+          <w:sz w:val="28"/>
+          <w:szCs w:val="28"/>
+        </w:rPr>
+      </w:pPr>
+      <w:r>
+        <w:rPr>
+          <w:rFonts w:ascii="Times New Roman" w:hAnsi="Times New Roman" w:cs="Times New Roman"/>
+          <w:sz w:val="28"/>
+          <w:szCs w:val="28"/>
+        </w:rPr>
         <w:t>Також у випадку неправильного введення даних, користувач отримає відповідні повідомлення. Це продемонстровано на рисунку 2.6.</w:t>
       </w:r>
     </w:p>
-    <w:p/>
-    <w:p>
-      <w:r>
-        <w:lastRenderedPageBreak/>
+    <w:p>
+      <w:pPr>
+        <w:rPr>
+          <w:rFonts w:ascii="Times New Roman" w:hAnsi="Times New Roman" w:cs="Times New Roman"/>
+          <w:sz w:val="28"/>
+          <w:szCs w:val="28"/>
+        </w:rPr>
+      </w:pPr>
+    </w:p>
+    <w:p>
+      <w:pPr>
+        <w:jc w:val="center"/>
+        <w:rPr>
+          <w:rFonts w:ascii="Times New Roman" w:hAnsi="Times New Roman" w:cs="Times New Roman"/>
+          <w:sz w:val="28"/>
+          <w:szCs w:val="28"/>
+        </w:rPr>
+      </w:pPr>
+      <w:r>
+        <w:rPr>
+          <w:rFonts w:ascii="Times New Roman" w:hAnsi="Times New Roman" w:cs="Times New Roman"/>
+          <w:noProof/>
+          <w:sz w:val="28"/>
+          <w:szCs w:val="28"/>
+        </w:rPr>
         <w:drawing>
-          <wp:inline distT="0" distB="0" distL="0" distR="0" wp14:anchorId="55D26667" wp14:editId="03AF5E4E">
-            <wp:extent cx="4763165" cy="2362530"/>
+          <wp:inline distT="0" distB="0" distL="0" distR="0" wp14:anchorId="55D26667" wp14:editId="02E4B3E0">
+            <wp:extent cx="4160520" cy="2063618"/>
             <wp:effectExtent l="0" t="0" r="0" b="0"/>
             <wp:docPr id="7" name="Рисунок 7"/>
             <wp:cNvGraphicFramePr>
@@ -1386,7 +1903,7 @@
                   <pic:spPr>
                     <a:xfrm>
                       <a:off x="0" y="0"/>
-                      <a:ext cx="4763165" cy="2362530"/>
+                      <a:ext cx="4188148" cy="2077321"/>
                     </a:xfrm>
                     <a:prstGeom prst="rect">
                       <a:avLst/>
@@ -1399,9 +1916,113 @@
         </w:drawing>
       </w:r>
     </w:p>
-    <w:p/>
-    <w:p>
-      <w:r>
+    <w:p>
+      <w:pPr>
+        <w:jc w:val="center"/>
+        <w:rPr>
+          <w:rFonts w:ascii="Times New Roman" w:hAnsi="Times New Roman" w:cs="Times New Roman"/>
+          <w:sz w:val="28"/>
+          <w:szCs w:val="28"/>
+        </w:rPr>
+      </w:pPr>
+      <w:r>
+        <w:rPr>
+          <w:rFonts w:ascii="Times New Roman" w:hAnsi="Times New Roman" w:cs="Times New Roman"/>
+          <w:sz w:val="28"/>
+          <w:szCs w:val="28"/>
+        </w:rPr>
+        <w:t>Рисунок 2.</w:t>
+      </w:r>
+      <w:r>
+        <w:rPr>
+          <w:rFonts w:ascii="Times New Roman" w:hAnsi="Times New Roman" w:cs="Times New Roman"/>
+          <w:sz w:val="28"/>
+          <w:szCs w:val="28"/>
+        </w:rPr>
+        <w:t>6</w:t>
+      </w:r>
+      <w:r>
+        <w:rPr>
+          <w:rFonts w:ascii="Times New Roman" w:hAnsi="Times New Roman" w:cs="Times New Roman"/>
+          <w:sz w:val="28"/>
+          <w:szCs w:val="28"/>
+        </w:rPr>
+        <w:t xml:space="preserve"> </w:t>
+      </w:r>
+      <w:r>
+        <w:rPr>
+          <w:rFonts w:ascii="Times New Roman" w:hAnsi="Times New Roman" w:cs="Times New Roman"/>
+          <w:sz w:val="28"/>
+          <w:szCs w:val="28"/>
+        </w:rPr>
+        <w:t>– Приклад помилки</w:t>
+      </w:r>
+    </w:p>
+    <w:p>
+      <w:pPr>
+        <w:rPr>
+          <w:rFonts w:ascii="Times New Roman" w:hAnsi="Times New Roman" w:cs="Times New Roman"/>
+          <w:sz w:val="28"/>
+          <w:szCs w:val="28"/>
+        </w:rPr>
+      </w:pPr>
+    </w:p>
+    <w:p>
+      <w:pPr>
+        <w:ind w:firstLine="708"/>
+        <w:jc w:val="both"/>
+        <w:rPr>
+          <w:rFonts w:ascii="Times New Roman" w:hAnsi="Times New Roman" w:cs="Times New Roman"/>
+          <w:sz w:val="28"/>
+          <w:szCs w:val="28"/>
+        </w:rPr>
+      </w:pPr>
+      <w:r>
+        <w:rPr>
+          <w:rFonts w:ascii="Times New Roman" w:hAnsi="Times New Roman" w:cs="Times New Roman"/>
+          <w:sz w:val="28"/>
+          <w:szCs w:val="28"/>
+        </w:rPr>
+        <w:t xml:space="preserve">Розроблено консольну програму </w:t>
+      </w:r>
+      <w:r>
+        <w:rPr>
+          <w:rFonts w:ascii="Times New Roman" w:hAnsi="Times New Roman" w:cs="Times New Roman"/>
+          <w:color w:val="000000"/>
+          <w:sz w:val="28"/>
+          <w:szCs w:val="28"/>
+          <w:shd w:val="clear" w:color="auto" w:fill="FFFFFF"/>
+        </w:rPr>
+        <w:t>для обчислення коренів квадратного рівняння.</w:t>
+      </w:r>
+      <w:r>
+        <w:rPr>
+          <w:rFonts w:ascii="Times New Roman" w:hAnsi="Times New Roman" w:cs="Times New Roman"/>
+          <w:color w:val="000000"/>
+          <w:sz w:val="28"/>
+          <w:szCs w:val="28"/>
+          <w:shd w:val="clear" w:color="auto" w:fill="FFFFFF"/>
+        </w:rPr>
+        <w:t xml:space="preserve"> Результат виконання програми подано на рисунку 2.7.</w:t>
+      </w:r>
+    </w:p>
+    <w:p>
+      <w:pPr>
+        <w:jc w:val="center"/>
+        <w:rPr>
+          <w:rFonts w:ascii="Times New Roman" w:hAnsi="Times New Roman" w:cs="Times New Roman"/>
+          <w:sz w:val="28"/>
+          <w:szCs w:val="28"/>
+        </w:rPr>
+      </w:pPr>
+      <w:r>
+        <w:rPr>
+          <w:rFonts w:ascii="Times New Roman" w:hAnsi="Times New Roman" w:cs="Times New Roman"/>
+          <w:noProof/>
+          <w:sz w:val="28"/>
+          <w:szCs w:val="28"/>
+        </w:rPr>
+        <w:lastRenderedPageBreak/>
         <w:drawing>
           <wp:inline distT="0" distB="0" distL="0" distR="0" wp14:anchorId="07154A29" wp14:editId="219DD9E4">
             <wp:extent cx="5943600" cy="2042160"/>
@@ -1440,7 +2061,103 @@
       </w:r>
     </w:p>
     <w:p>
-      <w:r>
+      <w:pPr>
+        <w:jc w:val="center"/>
+        <w:rPr>
+          <w:rFonts w:ascii="Times New Roman" w:hAnsi="Times New Roman" w:cs="Times New Roman"/>
+          <w:sz w:val="28"/>
+          <w:szCs w:val="28"/>
+        </w:rPr>
+      </w:pPr>
+      <w:r>
+        <w:rPr>
+          <w:rFonts w:ascii="Times New Roman" w:hAnsi="Times New Roman" w:cs="Times New Roman"/>
+          <w:sz w:val="28"/>
+          <w:szCs w:val="28"/>
+        </w:rPr>
+        <w:t>Рисунок 2.</w:t>
+      </w:r>
+      <w:r>
+        <w:rPr>
+          <w:rFonts w:ascii="Times New Roman" w:hAnsi="Times New Roman" w:cs="Times New Roman"/>
+          <w:sz w:val="28"/>
+          <w:szCs w:val="28"/>
+        </w:rPr>
+        <w:t>7</w:t>
+      </w:r>
+      <w:r>
+        <w:rPr>
+          <w:rFonts w:ascii="Times New Roman" w:hAnsi="Times New Roman" w:cs="Times New Roman"/>
+          <w:sz w:val="28"/>
+          <w:szCs w:val="28"/>
+        </w:rPr>
+        <w:t xml:space="preserve"> -</w:t>
+      </w:r>
+      <w:r>
+        <w:rPr>
+          <w:rFonts w:ascii="Times New Roman" w:hAnsi="Times New Roman" w:cs="Times New Roman"/>
+          <w:sz w:val="28"/>
+          <w:szCs w:val="28"/>
+        </w:rPr>
+        <w:t xml:space="preserve"> Результат виконання програми</w:t>
+      </w:r>
+    </w:p>
+    <w:p>
+      <w:pPr>
+        <w:jc w:val="both"/>
+        <w:rPr>
+          <w:rFonts w:ascii="Times New Roman" w:hAnsi="Times New Roman" w:cs="Times New Roman"/>
+          <w:sz w:val="28"/>
+          <w:szCs w:val="28"/>
+        </w:rPr>
+      </w:pPr>
+    </w:p>
+    <w:p>
+      <w:pPr>
+        <w:ind w:firstLine="708"/>
+        <w:jc w:val="both"/>
+        <w:rPr>
+          <w:rFonts w:ascii="Times New Roman" w:hAnsi="Times New Roman" w:cs="Times New Roman"/>
+          <w:sz w:val="28"/>
+          <w:szCs w:val="28"/>
+        </w:rPr>
+      </w:pPr>
+      <w:r>
+        <w:rPr>
+          <w:rFonts w:ascii="Times New Roman" w:hAnsi="Times New Roman" w:cs="Times New Roman"/>
+          <w:sz w:val="28"/>
+          <w:szCs w:val="28"/>
+        </w:rPr>
+        <w:t>Також розроблено систему помилок, якщо дискримінант буде від’ємним, то користувач отримає відповідне повідомлення. Це продемонстровано на рисунку 2.8.</w:t>
+      </w:r>
+    </w:p>
+    <w:p>
+      <w:pPr>
+        <w:ind w:firstLine="708"/>
+        <w:jc w:val="both"/>
+        <w:rPr>
+          <w:rFonts w:ascii="Times New Roman" w:hAnsi="Times New Roman" w:cs="Times New Roman"/>
+          <w:sz w:val="28"/>
+          <w:szCs w:val="28"/>
+        </w:rPr>
+      </w:pPr>
+    </w:p>
+    <w:p>
+      <w:pPr>
+        <w:jc w:val="center"/>
+        <w:rPr>
+          <w:rFonts w:ascii="Times New Roman" w:hAnsi="Times New Roman" w:cs="Times New Roman"/>
+          <w:sz w:val="28"/>
+          <w:szCs w:val="28"/>
+        </w:rPr>
+      </w:pPr>
+      <w:r>
+        <w:rPr>
+          <w:rFonts w:ascii="Times New Roman" w:hAnsi="Times New Roman" w:cs="Times New Roman"/>
+          <w:noProof/>
+          <w:sz w:val="28"/>
+          <w:szCs w:val="28"/>
+        </w:rPr>
         <w:drawing>
           <wp:inline distT="0" distB="0" distL="0" distR="0" wp14:anchorId="37E6008D" wp14:editId="0DAFF931">
             <wp:extent cx="5287113" cy="2343477"/>
@@ -1479,7 +2196,107 @@
       </w:r>
     </w:p>
     <w:p>
-      <w:r>
+      <w:pPr>
+        <w:jc w:val="center"/>
+        <w:rPr>
+          <w:rFonts w:ascii="Times New Roman" w:hAnsi="Times New Roman" w:cs="Times New Roman"/>
+          <w:sz w:val="28"/>
+          <w:szCs w:val="28"/>
+        </w:rPr>
+      </w:pPr>
+      <w:r>
+        <w:rPr>
+          <w:rFonts w:ascii="Times New Roman" w:hAnsi="Times New Roman" w:cs="Times New Roman"/>
+          <w:sz w:val="28"/>
+          <w:szCs w:val="28"/>
+        </w:rPr>
+        <w:t>Рисунок 2.</w:t>
+      </w:r>
+      <w:r>
+        <w:rPr>
+          <w:rFonts w:ascii="Times New Roman" w:hAnsi="Times New Roman" w:cs="Times New Roman"/>
+          <w:sz w:val="28"/>
+          <w:szCs w:val="28"/>
+        </w:rPr>
+        <w:t>8</w:t>
+      </w:r>
+      <w:r>
+        <w:rPr>
+          <w:rFonts w:ascii="Times New Roman" w:hAnsi="Times New Roman" w:cs="Times New Roman"/>
+          <w:sz w:val="28"/>
+          <w:szCs w:val="28"/>
+        </w:rPr>
+        <w:t xml:space="preserve"> </w:t>
+      </w:r>
+      <w:r>
+        <w:rPr>
+          <w:rFonts w:ascii="Times New Roman" w:hAnsi="Times New Roman" w:cs="Times New Roman"/>
+          <w:sz w:val="28"/>
+          <w:szCs w:val="28"/>
+        </w:rPr>
+        <w:t>–</w:t>
+      </w:r>
+      <w:r>
+        <w:rPr>
+          <w:rFonts w:ascii="Times New Roman" w:hAnsi="Times New Roman" w:cs="Times New Roman"/>
+          <w:sz w:val="28"/>
+          <w:szCs w:val="28"/>
+        </w:rPr>
+        <w:t xml:space="preserve"> </w:t>
+      </w:r>
+      <w:r>
+        <w:rPr>
+          <w:rFonts w:ascii="Times New Roman" w:hAnsi="Times New Roman" w:cs="Times New Roman"/>
+          <w:sz w:val="28"/>
+          <w:szCs w:val="28"/>
+        </w:rPr>
+        <w:t>Повідомлення, коли дискримінант від’ємний</w:t>
+      </w:r>
+    </w:p>
+    <w:p>
+      <w:pPr>
+        <w:rPr>
+          <w:rFonts w:ascii="Times New Roman" w:hAnsi="Times New Roman" w:cs="Times New Roman"/>
+          <w:sz w:val="28"/>
+          <w:szCs w:val="28"/>
+        </w:rPr>
+      </w:pPr>
+    </w:p>
+    <w:p>
+      <w:pPr>
+        <w:ind w:firstLine="708"/>
+        <w:jc w:val="both"/>
+        <w:rPr>
+          <w:rFonts w:ascii="Times New Roman" w:hAnsi="Times New Roman" w:cs="Times New Roman"/>
+          <w:sz w:val="28"/>
+          <w:szCs w:val="28"/>
+        </w:rPr>
+      </w:pPr>
+      <w:r>
+        <w:rPr>
+          <w:rFonts w:ascii="Times New Roman" w:hAnsi="Times New Roman" w:cs="Times New Roman"/>
+          <w:sz w:val="28"/>
+          <w:szCs w:val="28"/>
+        </w:rPr>
+        <w:t>Якщо дискримінант буде рівний нулю, то рівняння буде містити 1 корінь. Це продемонстровано на рисунку 2.9.</w:t>
+      </w:r>
+    </w:p>
+    <w:p>
+      <w:pPr>
+        <w:jc w:val="center"/>
+        <w:rPr>
+          <w:rFonts w:ascii="Times New Roman" w:hAnsi="Times New Roman" w:cs="Times New Roman"/>
+          <w:sz w:val="28"/>
+          <w:szCs w:val="28"/>
+        </w:rPr>
+      </w:pPr>
+      <w:r>
+        <w:rPr>
+          <w:rFonts w:ascii="Times New Roman" w:hAnsi="Times New Roman" w:cs="Times New Roman"/>
+          <w:noProof/>
+          <w:sz w:val="28"/>
+          <w:szCs w:val="28"/>
+        </w:rPr>
         <w:lastRenderedPageBreak/>
         <w:drawing>
           <wp:inline distT="0" distB="0" distL="0" distR="0" wp14:anchorId="5F819C0A" wp14:editId="0A4C1270">
@@ -1519,7 +2336,172 @@
       </w:r>
     </w:p>
     <w:p>
-      <w:r>
+      <w:pPr>
+        <w:jc w:val="center"/>
+        <w:rPr>
+          <w:rFonts w:ascii="Times New Roman" w:hAnsi="Times New Roman" w:cs="Times New Roman"/>
+          <w:sz w:val="28"/>
+          <w:szCs w:val="28"/>
+        </w:rPr>
+      </w:pPr>
+      <w:r>
+        <w:rPr>
+          <w:rFonts w:ascii="Times New Roman" w:hAnsi="Times New Roman" w:cs="Times New Roman"/>
+          <w:sz w:val="28"/>
+          <w:szCs w:val="28"/>
+        </w:rPr>
+        <w:t>Рисунок 2.</w:t>
+      </w:r>
+      <w:r>
+        <w:rPr>
+          <w:rFonts w:ascii="Times New Roman" w:hAnsi="Times New Roman" w:cs="Times New Roman"/>
+          <w:sz w:val="28"/>
+          <w:szCs w:val="28"/>
+        </w:rPr>
+        <w:t>9</w:t>
+      </w:r>
+      <w:r>
+        <w:rPr>
+          <w:rFonts w:ascii="Times New Roman" w:hAnsi="Times New Roman" w:cs="Times New Roman"/>
+          <w:sz w:val="28"/>
+          <w:szCs w:val="28"/>
+        </w:rPr>
+        <w:t xml:space="preserve"> </w:t>
+      </w:r>
+      <w:r>
+        <w:rPr>
+          <w:rFonts w:ascii="Times New Roman" w:hAnsi="Times New Roman" w:cs="Times New Roman"/>
+          <w:sz w:val="28"/>
+          <w:szCs w:val="28"/>
+        </w:rPr>
+        <w:t>–</w:t>
+      </w:r>
+      <w:r>
+        <w:rPr>
+          <w:rFonts w:ascii="Times New Roman" w:hAnsi="Times New Roman" w:cs="Times New Roman"/>
+          <w:sz w:val="28"/>
+          <w:szCs w:val="28"/>
+        </w:rPr>
+        <w:t xml:space="preserve"> </w:t>
+      </w:r>
+      <w:r>
+        <w:rPr>
+          <w:rFonts w:ascii="Times New Roman" w:hAnsi="Times New Roman" w:cs="Times New Roman"/>
+          <w:sz w:val="28"/>
+          <w:szCs w:val="28"/>
+        </w:rPr>
+        <w:t>Результат виконання програми</w:t>
+      </w:r>
+    </w:p>
+    <w:p>
+      <w:pPr>
+        <w:rPr>
+          <w:rFonts w:ascii="Times New Roman" w:hAnsi="Times New Roman" w:cs="Times New Roman"/>
+          <w:sz w:val="28"/>
+          <w:szCs w:val="28"/>
+        </w:rPr>
+      </w:pPr>
+    </w:p>
+    <w:p>
+      <w:pPr>
+        <w:ind w:firstLine="708"/>
+        <w:jc w:val="both"/>
+        <w:rPr>
+          <w:rFonts w:ascii="Times New Roman" w:hAnsi="Times New Roman" w:cs="Times New Roman"/>
+          <w:sz w:val="28"/>
+          <w:szCs w:val="28"/>
+        </w:rPr>
+      </w:pPr>
+      <w:r>
+        <w:rPr>
+          <w:rFonts w:ascii="Times New Roman" w:hAnsi="Times New Roman" w:cs="Times New Roman"/>
+          <w:sz w:val="28"/>
+          <w:szCs w:val="28"/>
+        </w:rPr>
+        <w:t>Розроблено програму</w:t>
+      </w:r>
+      <w:r>
+        <w:rPr>
+          <w:rFonts w:ascii="Times New Roman" w:hAnsi="Times New Roman" w:cs="Times New Roman"/>
+          <w:sz w:val="28"/>
+          <w:szCs w:val="28"/>
+        </w:rPr>
+        <w:t xml:space="preserve"> на основі </w:t>
+      </w:r>
+      <w:r>
+        <w:rPr>
+          <w:rFonts w:ascii="Times New Roman" w:hAnsi="Times New Roman" w:cs="Times New Roman"/>
+          <w:sz w:val="28"/>
+          <w:szCs w:val="28"/>
+          <w:lang w:val="en-US"/>
+        </w:rPr>
+        <w:t xml:space="preserve">WPF </w:t>
+      </w:r>
+      <w:r>
+        <w:rPr>
+          <w:rFonts w:ascii="Times New Roman" w:hAnsi="Times New Roman" w:cs="Times New Roman"/>
+          <w:sz w:val="28"/>
+          <w:szCs w:val="28"/>
+        </w:rPr>
+        <w:t xml:space="preserve"> </w:t>
+      </w:r>
+      <w:r>
+        <w:rPr>
+          <w:rFonts w:ascii="Times New Roman" w:hAnsi="Times New Roman" w:cs="Times New Roman"/>
+          <w:color w:val="000000"/>
+          <w:sz w:val="28"/>
+          <w:szCs w:val="28"/>
+          <w:shd w:val="clear" w:color="auto" w:fill="FFFFFF"/>
+        </w:rPr>
+        <w:t>для обчислення коренів квадратного рівняння. Результат виконання програми подано на рисунку 2.</w:t>
+      </w:r>
+      <w:r>
+        <w:rPr>
+          <w:rFonts w:ascii="Times New Roman" w:hAnsi="Times New Roman" w:cs="Times New Roman"/>
+          <w:color w:val="000000"/>
+          <w:sz w:val="28"/>
+          <w:szCs w:val="28"/>
+          <w:shd w:val="clear" w:color="auto" w:fill="FFFFFF"/>
+          <w:lang w:val="en-US"/>
+        </w:rPr>
+        <w:t>10</w:t>
+      </w:r>
+      <w:r>
+        <w:rPr>
+          <w:rFonts w:ascii="Times New Roman" w:hAnsi="Times New Roman" w:cs="Times New Roman"/>
+          <w:color w:val="000000"/>
+          <w:sz w:val="28"/>
+          <w:szCs w:val="28"/>
+          <w:shd w:val="clear" w:color="auto" w:fill="FFFFFF"/>
+        </w:rPr>
+        <w:t>.</w:t>
+      </w:r>
+    </w:p>
+    <w:p>
+      <w:pPr>
+        <w:rPr>
+          <w:rFonts w:ascii="Times New Roman" w:hAnsi="Times New Roman" w:cs="Times New Roman"/>
+          <w:sz w:val="28"/>
+          <w:szCs w:val="28"/>
+        </w:rPr>
+      </w:pPr>
+    </w:p>
+    <w:p>
+      <w:pPr>
+        <w:jc w:val="center"/>
+        <w:rPr>
+          <w:rFonts w:ascii="Times New Roman" w:hAnsi="Times New Roman" w:cs="Times New Roman"/>
+          <w:sz w:val="28"/>
+          <w:szCs w:val="28"/>
+        </w:rPr>
+      </w:pPr>
+      <w:r>
+        <w:rPr>
+          <w:rFonts w:ascii="Times New Roman" w:hAnsi="Times New Roman" w:cs="Times New Roman"/>
+          <w:noProof/>
+          <w:sz w:val="28"/>
+          <w:szCs w:val="28"/>
+        </w:rPr>
         <w:drawing>
           <wp:inline distT="0" distB="0" distL="0" distR="0" wp14:anchorId="26653CBA" wp14:editId="14D783C4">
             <wp:extent cx="5487166" cy="2543530"/>
@@ -1558,11 +2540,88 @@
       </w:r>
     </w:p>
     <w:p>
-      <w:r>
+      <w:pPr>
+        <w:jc w:val="center"/>
+        <w:rPr>
+          <w:rFonts w:ascii="Times New Roman" w:hAnsi="Times New Roman" w:cs="Times New Roman"/>
+          <w:sz w:val="28"/>
+          <w:szCs w:val="28"/>
+        </w:rPr>
+      </w:pPr>
+      <w:r>
+        <w:rPr>
+          <w:rFonts w:ascii="Times New Roman" w:hAnsi="Times New Roman" w:cs="Times New Roman"/>
+          <w:sz w:val="28"/>
+          <w:szCs w:val="28"/>
+        </w:rPr>
+        <w:t>Рисунок 2.</w:t>
+      </w:r>
+      <w:r>
+        <w:rPr>
+          <w:rFonts w:ascii="Times New Roman" w:hAnsi="Times New Roman" w:cs="Times New Roman"/>
+          <w:sz w:val="28"/>
+          <w:szCs w:val="28"/>
+        </w:rPr>
+        <w:t>10</w:t>
+      </w:r>
+      <w:r>
+        <w:rPr>
+          <w:rFonts w:ascii="Times New Roman" w:hAnsi="Times New Roman" w:cs="Times New Roman"/>
+          <w:sz w:val="28"/>
+          <w:szCs w:val="28"/>
+        </w:rPr>
+        <w:t xml:space="preserve"> – Результат виконання програми</w:t>
+      </w:r>
+    </w:p>
+    <w:p>
+      <w:pPr>
+        <w:rPr>
+          <w:rFonts w:ascii="Times New Roman" w:hAnsi="Times New Roman" w:cs="Times New Roman"/>
+          <w:sz w:val="28"/>
+          <w:szCs w:val="28"/>
+        </w:rPr>
+      </w:pPr>
+    </w:p>
+    <w:p>
+      <w:pPr>
+        <w:ind w:firstLine="708"/>
+        <w:jc w:val="both"/>
+        <w:rPr>
+          <w:rFonts w:ascii="Times New Roman" w:hAnsi="Times New Roman" w:cs="Times New Roman"/>
+          <w:sz w:val="28"/>
+          <w:szCs w:val="28"/>
+        </w:rPr>
+      </w:pPr>
+      <w:r>
+        <w:rPr>
+          <w:rFonts w:ascii="Times New Roman" w:hAnsi="Times New Roman" w:cs="Times New Roman"/>
+          <w:sz w:val="28"/>
+          <w:szCs w:val="28"/>
+        </w:rPr>
+        <w:t>Якщо рівняння містить 1 корінь, то зайві елементи інтерфейсу приховуються, як це подано на рисунку 2.11.</w:t>
+      </w:r>
+    </w:p>
+    <w:p>
+      <w:pPr>
+        <w:jc w:val="center"/>
+        <w:rPr>
+          <w:rFonts w:ascii="Times New Roman" w:hAnsi="Times New Roman" w:cs="Times New Roman"/>
+          <w:sz w:val="28"/>
+          <w:szCs w:val="28"/>
+        </w:rPr>
+      </w:pPr>
+      <w:r>
+        <w:rPr>
+          <w:rFonts w:ascii="Times New Roman" w:hAnsi="Times New Roman" w:cs="Times New Roman"/>
+          <w:noProof/>
+          <w:sz w:val="28"/>
+          <w:szCs w:val="28"/>
+        </w:rPr>
+        <w:lastRenderedPageBreak/>
         <w:drawing>
-          <wp:inline distT="0" distB="0" distL="0" distR="0" wp14:anchorId="1FC158B7" wp14:editId="577535ED">
-            <wp:extent cx="4896533" cy="2429214"/>
-            <wp:effectExtent l="0" t="0" r="0" b="9525"/>
+          <wp:inline distT="0" distB="0" distL="0" distR="0" wp14:anchorId="1FC158B7" wp14:editId="68F302FE">
+            <wp:extent cx="4146042" cy="2056889"/>
+            <wp:effectExtent l="0" t="0" r="6985" b="635"/>
             <wp:docPr id="12" name="Рисунок 12"/>
             <wp:cNvGraphicFramePr>
               <a:graphicFrameLocks xmlns:a="http://schemas.openxmlformats.org/drawingml/2006/main" noChangeAspect="1"/>
@@ -1583,7 +2642,7 @@
                   <pic:spPr>
                     <a:xfrm>
                       <a:off x="0" y="0"/>
-                      <a:ext cx="4896533" cy="2429214"/>
+                      <a:ext cx="4156214" cy="2061935"/>
                     </a:xfrm>
                     <a:prstGeom prst="rect">
                       <a:avLst/>
@@ -1596,6 +2655,509 @@
         </w:drawing>
       </w:r>
     </w:p>
+    <w:p>
+      <w:pPr>
+        <w:jc w:val="center"/>
+        <w:rPr>
+          <w:rFonts w:ascii="Times New Roman" w:hAnsi="Times New Roman" w:cs="Times New Roman"/>
+          <w:sz w:val="28"/>
+          <w:szCs w:val="28"/>
+        </w:rPr>
+      </w:pPr>
+      <w:r>
+        <w:rPr>
+          <w:rFonts w:ascii="Times New Roman" w:hAnsi="Times New Roman" w:cs="Times New Roman"/>
+          <w:sz w:val="28"/>
+          <w:szCs w:val="28"/>
+        </w:rPr>
+        <w:t>Рисунок 2.</w:t>
+      </w:r>
+      <w:r>
+        <w:rPr>
+          <w:rFonts w:ascii="Times New Roman" w:hAnsi="Times New Roman" w:cs="Times New Roman"/>
+          <w:sz w:val="28"/>
+          <w:szCs w:val="28"/>
+        </w:rPr>
+        <w:t>11</w:t>
+      </w:r>
+      <w:r>
+        <w:rPr>
+          <w:rFonts w:ascii="Times New Roman" w:hAnsi="Times New Roman" w:cs="Times New Roman"/>
+          <w:sz w:val="28"/>
+          <w:szCs w:val="28"/>
+        </w:rPr>
+        <w:t xml:space="preserve"> – </w:t>
+      </w:r>
+      <w:r>
+        <w:rPr>
+          <w:rFonts w:ascii="Times New Roman" w:hAnsi="Times New Roman" w:cs="Times New Roman"/>
+          <w:sz w:val="28"/>
+          <w:szCs w:val="28"/>
+        </w:rPr>
+        <w:t>Приховування елементів інтерфейсів</w:t>
+      </w:r>
+    </w:p>
+    <w:p>
+      <w:pPr>
+        <w:rPr>
+          <w:rFonts w:ascii="Times New Roman" w:hAnsi="Times New Roman" w:cs="Times New Roman"/>
+          <w:sz w:val="28"/>
+          <w:szCs w:val="28"/>
+        </w:rPr>
+      </w:pPr>
+    </w:p>
+    <w:p>
+      <w:pPr>
+        <w:ind w:firstLine="708"/>
+        <w:rPr>
+          <w:rFonts w:ascii="Times New Roman" w:hAnsi="Times New Roman" w:cs="Times New Roman"/>
+          <w:color w:val="000000"/>
+          <w:sz w:val="28"/>
+          <w:szCs w:val="28"/>
+          <w:shd w:val="clear" w:color="auto" w:fill="FFFFFF"/>
+          <w:lang w:val="en-US"/>
+        </w:rPr>
+      </w:pPr>
+      <w:r>
+        <w:rPr>
+          <w:rFonts w:ascii="Times New Roman" w:hAnsi="Times New Roman" w:cs="Times New Roman"/>
+          <w:sz w:val="28"/>
+          <w:szCs w:val="28"/>
+        </w:rPr>
+        <w:t xml:space="preserve">Розроблено </w:t>
+      </w:r>
+      <w:r>
+        <w:rPr>
+          <w:rFonts w:ascii="Times New Roman" w:hAnsi="Times New Roman" w:cs="Times New Roman"/>
+          <w:color w:val="000000"/>
+          <w:sz w:val="28"/>
+          <w:szCs w:val="28"/>
+          <w:shd w:val="clear" w:color="auto" w:fill="FFFFFF"/>
+        </w:rPr>
+        <w:t>консольну програму для обчислення трьох значень</w:t>
+      </w:r>
+      <w:r>
+        <w:rPr>
+          <w:rFonts w:ascii="Times New Roman" w:hAnsi="Times New Roman" w:cs="Times New Roman"/>
+          <w:color w:val="000000"/>
+          <w:sz w:val="28"/>
+          <w:szCs w:val="28"/>
+          <w:shd w:val="clear" w:color="auto" w:fill="FFFFFF"/>
+          <w:lang w:val="en-US"/>
+        </w:rPr>
+        <w:t>:</w:t>
+      </w:r>
+    </w:p>
+    <w:p>
+      <w:pPr>
+        <w:rPr>
+          <w:rFonts w:ascii="Times New Roman" w:hAnsi="Times New Roman" w:cs="Times New Roman"/>
+          <w:sz w:val="28"/>
+          <w:szCs w:val="28"/>
+        </w:rPr>
+      </w:pPr>
+      <w:r>
+        <w:rPr>
+          <w:rFonts w:ascii="Times New Roman" w:hAnsi="Times New Roman" w:cs="Times New Roman"/>
+          <w:sz w:val="28"/>
+          <w:szCs w:val="28"/>
+        </w:rPr>
+        <w:drawing>
+          <wp:inline distT="0" distB="0" distL="0" distR="0" wp14:anchorId="4442C146" wp14:editId="4FFD8520">
+            <wp:extent cx="2610214" cy="1295581"/>
+            <wp:effectExtent l="0" t="0" r="0" b="0"/>
+            <wp:docPr id="13" name="Рисунок 13"/>
+            <wp:cNvGraphicFramePr>
+              <a:graphicFrameLocks xmlns:a="http://schemas.openxmlformats.org/drawingml/2006/main" noChangeAspect="1"/>
+            </wp:cNvGraphicFramePr>
+            <a:graphic xmlns:a="http://schemas.openxmlformats.org/drawingml/2006/main">
+              <a:graphicData uri="http://schemas.openxmlformats.org/drawingml/2006/picture">
+                <pic:pic xmlns:pic="http://schemas.openxmlformats.org/drawingml/2006/picture">
+                  <pic:nvPicPr>
+                    <pic:cNvPr id="1" name=""/>
+                    <pic:cNvPicPr/>
+                  </pic:nvPicPr>
+                  <pic:blipFill>
+                    <a:blip r:embed="rId15"/>
+                    <a:stretch>
+                      <a:fillRect/>
+                    </a:stretch>
+                  </pic:blipFill>
+                  <pic:spPr>
+                    <a:xfrm>
+                      <a:off x="0" y="0"/>
+                      <a:ext cx="2610214" cy="1295581"/>
+                    </a:xfrm>
+                    <a:prstGeom prst="rect">
+                      <a:avLst/>
+                    </a:prstGeom>
+                  </pic:spPr>
+                </pic:pic>
+              </a:graphicData>
+            </a:graphic>
+          </wp:inline>
+        </w:drawing>
+      </w:r>
+    </w:p>
+    <w:p>
+      <w:pPr>
+        <w:ind w:firstLine="708"/>
+        <w:rPr>
+          <w:rFonts w:ascii="Times New Roman" w:hAnsi="Times New Roman" w:cs="Times New Roman"/>
+          <w:sz w:val="28"/>
+          <w:szCs w:val="28"/>
+        </w:rPr>
+      </w:pPr>
+      <w:r>
+        <w:rPr>
+          <w:rFonts w:ascii="Times New Roman" w:hAnsi="Times New Roman" w:cs="Times New Roman"/>
+          <w:sz w:val="28"/>
+          <w:szCs w:val="28"/>
+        </w:rPr>
+        <w:t>Результат виконання програми подано на рисунку 2.12.</w:t>
+      </w:r>
+    </w:p>
+    <w:p>
+      <w:pPr>
+        <w:ind w:firstLine="708"/>
+        <w:rPr>
+          <w:rFonts w:ascii="Times New Roman" w:hAnsi="Times New Roman" w:cs="Times New Roman"/>
+          <w:sz w:val="28"/>
+          <w:szCs w:val="28"/>
+        </w:rPr>
+      </w:pPr>
+    </w:p>
+    <w:p>
+      <w:pPr>
+        <w:jc w:val="center"/>
+        <w:rPr>
+          <w:rFonts w:ascii="Times New Roman" w:hAnsi="Times New Roman" w:cs="Times New Roman"/>
+          <w:sz w:val="28"/>
+          <w:szCs w:val="28"/>
+        </w:rPr>
+      </w:pPr>
+      <w:r>
+        <w:rPr>
+          <w:rFonts w:ascii="Times New Roman" w:hAnsi="Times New Roman" w:cs="Times New Roman"/>
+          <w:sz w:val="28"/>
+          <w:szCs w:val="28"/>
+        </w:rPr>
+        <w:drawing>
+          <wp:inline distT="0" distB="0" distL="0" distR="0" wp14:anchorId="1F610A20" wp14:editId="49085930">
+            <wp:extent cx="3757930" cy="2678163"/>
+            <wp:effectExtent l="0" t="0" r="0" b="8255"/>
+            <wp:docPr id="6" name="Рисунок 6"/>
+            <wp:cNvGraphicFramePr>
+              <a:graphicFrameLocks xmlns:a="http://schemas.openxmlformats.org/drawingml/2006/main" noChangeAspect="1"/>
+            </wp:cNvGraphicFramePr>
+            <a:graphic xmlns:a="http://schemas.openxmlformats.org/drawingml/2006/main">
+              <a:graphicData uri="http://schemas.openxmlformats.org/drawingml/2006/picture">
+                <pic:pic xmlns:pic="http://schemas.openxmlformats.org/drawingml/2006/picture">
+                  <pic:nvPicPr>
+                    <pic:cNvPr id="1" name=""/>
+                    <pic:cNvPicPr/>
+                  </pic:nvPicPr>
+                  <pic:blipFill>
+                    <a:blip r:embed="rId16"/>
+                    <a:stretch>
+                      <a:fillRect/>
+                    </a:stretch>
+                  </pic:blipFill>
+                  <pic:spPr>
+                    <a:xfrm>
+                      <a:off x="0" y="0"/>
+                      <a:ext cx="3772317" cy="2688416"/>
+                    </a:xfrm>
+                    <a:prstGeom prst="rect">
+                      <a:avLst/>
+                    </a:prstGeom>
+                  </pic:spPr>
+                </pic:pic>
+              </a:graphicData>
+            </a:graphic>
+          </wp:inline>
+        </w:drawing>
+      </w:r>
+    </w:p>
+    <w:p>
+      <w:pPr>
+        <w:jc w:val="center"/>
+        <w:rPr>
+          <w:rFonts w:ascii="Times New Roman" w:hAnsi="Times New Roman" w:cs="Times New Roman"/>
+          <w:sz w:val="28"/>
+          <w:szCs w:val="28"/>
+        </w:rPr>
+      </w:pPr>
+      <w:r>
+        <w:rPr>
+          <w:rFonts w:ascii="Times New Roman" w:hAnsi="Times New Roman" w:cs="Times New Roman"/>
+          <w:sz w:val="28"/>
+          <w:szCs w:val="28"/>
+        </w:rPr>
+        <w:t>Рисунок 2.</w:t>
+      </w:r>
+      <w:r>
+        <w:rPr>
+          <w:rFonts w:ascii="Times New Roman" w:hAnsi="Times New Roman" w:cs="Times New Roman"/>
+          <w:sz w:val="28"/>
+          <w:szCs w:val="28"/>
+        </w:rPr>
+        <w:t>12</w:t>
+      </w:r>
+      <w:r>
+        <w:rPr>
+          <w:rFonts w:ascii="Times New Roman" w:hAnsi="Times New Roman" w:cs="Times New Roman"/>
+          <w:sz w:val="28"/>
+          <w:szCs w:val="28"/>
+        </w:rPr>
+        <w:t xml:space="preserve"> – Результат виконання програми</w:t>
+      </w:r>
+    </w:p>
+    <w:p>
+      <w:pPr>
+        <w:ind w:firstLine="708"/>
+        <w:rPr>
+          <w:rFonts w:ascii="Times New Roman" w:hAnsi="Times New Roman" w:cs="Times New Roman"/>
+          <w:sz w:val="28"/>
+          <w:szCs w:val="28"/>
+        </w:rPr>
+      </w:pPr>
+      <w:r>
+        <w:rPr>
+          <w:rFonts w:ascii="Times New Roman" w:hAnsi="Times New Roman" w:cs="Times New Roman"/>
+          <w:sz w:val="28"/>
+          <w:szCs w:val="28"/>
+        </w:rPr>
+        <w:lastRenderedPageBreak/>
+        <w:t xml:space="preserve">Виконано </w:t>
+      </w:r>
+      <w:proofErr w:type="spellStart"/>
+      <w:r>
+        <w:rPr>
+          <w:rFonts w:ascii="Times New Roman" w:hAnsi="Times New Roman" w:cs="Times New Roman"/>
+          <w:sz w:val="28"/>
+          <w:szCs w:val="28"/>
+        </w:rPr>
+        <w:t>коміт</w:t>
+      </w:r>
+      <w:proofErr w:type="spellEnd"/>
+      <w:r>
+        <w:rPr>
+          <w:rFonts w:ascii="Times New Roman" w:hAnsi="Times New Roman" w:cs="Times New Roman"/>
+          <w:sz w:val="28"/>
+          <w:szCs w:val="28"/>
+        </w:rPr>
+        <w:t xml:space="preserve"> та пуш у віддалений репозиторій</w:t>
+      </w:r>
+      <w:r>
+        <w:rPr>
+          <w:rFonts w:ascii="Times New Roman" w:hAnsi="Times New Roman" w:cs="Times New Roman"/>
+          <w:sz w:val="28"/>
+          <w:szCs w:val="28"/>
+        </w:rPr>
+        <w:t>. Надано доступ викладачу.</w:t>
+      </w:r>
+    </w:p>
+    <w:p>
+      <w:pPr>
+        <w:rPr>
+          <w:rFonts w:ascii="Times New Roman" w:hAnsi="Times New Roman" w:cs="Times New Roman"/>
+          <w:sz w:val="28"/>
+          <w:szCs w:val="28"/>
+        </w:rPr>
+      </w:pPr>
+    </w:p>
+    <w:p>
+      <w:pPr>
+        <w:jc w:val="both"/>
+        <w:rPr>
+          <w:rFonts w:ascii="Times New Roman" w:hAnsi="Times New Roman" w:cs="Times New Roman"/>
+          <w:sz w:val="28"/>
+          <w:szCs w:val="28"/>
+        </w:rPr>
+      </w:pPr>
+      <w:r>
+        <w:rPr>
+          <w:rFonts w:ascii="Times New Roman" w:hAnsi="Times New Roman" w:cs="Times New Roman"/>
+          <w:sz w:val="28"/>
+          <w:szCs w:val="28"/>
+        </w:rPr>
+        <w:tab/>
+      </w:r>
+      <w:r>
+        <w:rPr>
+          <w:rFonts w:ascii="Times New Roman" w:hAnsi="Times New Roman" w:cs="Times New Roman"/>
+          <w:b/>
+          <w:bCs/>
+          <w:sz w:val="28"/>
+          <w:szCs w:val="28"/>
+        </w:rPr>
+        <w:t>Висновок:</w:t>
+      </w:r>
+      <w:r>
+        <w:rPr>
+          <w:rFonts w:ascii="Times New Roman" w:hAnsi="Times New Roman" w:cs="Times New Roman"/>
+          <w:sz w:val="28"/>
+          <w:szCs w:val="28"/>
+        </w:rPr>
+        <w:t xml:space="preserve"> під час виконання лабораторної роботи </w:t>
+      </w:r>
+      <w:r>
+        <w:rPr>
+          <w:rFonts w:ascii="Times New Roman" w:hAnsi="Times New Roman" w:cs="Times New Roman"/>
+          <w:color w:val="000000"/>
+          <w:sz w:val="28"/>
+          <w:szCs w:val="28"/>
+          <w:shd w:val="clear" w:color="auto" w:fill="FFFFFF"/>
+        </w:rPr>
+        <w:t>н</w:t>
+      </w:r>
+      <w:proofErr w:type="spellStart"/>
+      <w:r>
+        <w:rPr>
+          <w:rFonts w:ascii="Times New Roman" w:hAnsi="Times New Roman" w:cs="Times New Roman"/>
+          <w:color w:val="000000"/>
+          <w:sz w:val="28"/>
+          <w:szCs w:val="28"/>
+          <w:shd w:val="clear" w:color="auto" w:fill="FFFFFF"/>
+          <w:lang w:val="en-US"/>
+        </w:rPr>
+        <w:t>абут</w:t>
+      </w:r>
+      <w:proofErr w:type="spellEnd"/>
+      <w:r>
+        <w:rPr>
+          <w:rFonts w:ascii="Times New Roman" w:hAnsi="Times New Roman" w:cs="Times New Roman"/>
+          <w:color w:val="000000"/>
+          <w:sz w:val="28"/>
+          <w:szCs w:val="28"/>
+          <w:shd w:val="clear" w:color="auto" w:fill="FFFFFF"/>
+        </w:rPr>
+        <w:t>о</w:t>
+      </w:r>
+      <w:r>
+        <w:rPr>
+          <w:rFonts w:ascii="Times New Roman" w:hAnsi="Times New Roman" w:cs="Times New Roman"/>
+          <w:color w:val="000000"/>
+          <w:sz w:val="28"/>
+          <w:szCs w:val="28"/>
+          <w:shd w:val="clear" w:color="auto" w:fill="FFFFFF"/>
+          <w:lang w:val="en-US"/>
+        </w:rPr>
+        <w:t xml:space="preserve"> </w:t>
+      </w:r>
+      <w:proofErr w:type="spellStart"/>
+      <w:r>
+        <w:rPr>
+          <w:rFonts w:ascii="Times New Roman" w:hAnsi="Times New Roman" w:cs="Times New Roman"/>
+          <w:color w:val="000000"/>
+          <w:sz w:val="28"/>
+          <w:szCs w:val="28"/>
+          <w:shd w:val="clear" w:color="auto" w:fill="FFFFFF"/>
+          <w:lang w:val="en-US"/>
+        </w:rPr>
+        <w:t>практичного</w:t>
+      </w:r>
+      <w:proofErr w:type="spellEnd"/>
+      <w:r>
+        <w:rPr>
+          <w:rFonts w:ascii="Times New Roman" w:hAnsi="Times New Roman" w:cs="Times New Roman"/>
+          <w:color w:val="000000"/>
+          <w:sz w:val="28"/>
+          <w:szCs w:val="28"/>
+          <w:shd w:val="clear" w:color="auto" w:fill="FFFFFF"/>
+          <w:lang w:val="en-US"/>
+        </w:rPr>
+        <w:t xml:space="preserve"> </w:t>
+      </w:r>
+      <w:proofErr w:type="spellStart"/>
+      <w:r>
+        <w:rPr>
+          <w:rFonts w:ascii="Times New Roman" w:hAnsi="Times New Roman" w:cs="Times New Roman"/>
+          <w:color w:val="000000"/>
+          <w:sz w:val="28"/>
+          <w:szCs w:val="28"/>
+          <w:shd w:val="clear" w:color="auto" w:fill="FFFFFF"/>
+          <w:lang w:val="en-US"/>
+        </w:rPr>
+        <w:t>досвіду</w:t>
+      </w:r>
+      <w:proofErr w:type="spellEnd"/>
+      <w:r>
+        <w:rPr>
+          <w:rFonts w:ascii="Times New Roman" w:hAnsi="Times New Roman" w:cs="Times New Roman"/>
+          <w:color w:val="000000"/>
+          <w:sz w:val="28"/>
+          <w:szCs w:val="28"/>
+          <w:shd w:val="clear" w:color="auto" w:fill="FFFFFF"/>
+          <w:lang w:val="en-US"/>
+        </w:rPr>
+        <w:t> </w:t>
+      </w:r>
+      <w:r>
+        <w:rPr>
+          <w:rFonts w:ascii="Times New Roman" w:hAnsi="Times New Roman" w:cs="Times New Roman"/>
+          <w:color w:val="000000"/>
+          <w:sz w:val="28"/>
+          <w:szCs w:val="28"/>
+          <w:shd w:val="clear" w:color="auto" w:fill="FFFFFF"/>
+        </w:rPr>
+        <w:t>створення програм з графічним інтерфейсом користувача на основі технології </w:t>
+      </w:r>
+      <w:r>
+        <w:rPr>
+          <w:rFonts w:ascii="Times New Roman" w:hAnsi="Times New Roman" w:cs="Times New Roman"/>
+          <w:color w:val="000000"/>
+          <w:sz w:val="28"/>
+          <w:szCs w:val="28"/>
+          <w:shd w:val="clear" w:color="auto" w:fill="FFFFFF"/>
+          <w:lang w:val="en-US"/>
+        </w:rPr>
+        <w:t>Windows Presentation Foundation</w:t>
+      </w:r>
+      <w:r>
+        <w:rPr>
+          <w:rFonts w:ascii="Times New Roman" w:hAnsi="Times New Roman" w:cs="Times New Roman"/>
+          <w:color w:val="000000"/>
+          <w:sz w:val="28"/>
+          <w:szCs w:val="28"/>
+          <w:shd w:val="clear" w:color="auto" w:fill="FFFFFF"/>
+        </w:rPr>
+        <w:t>. Закріп</w:t>
+      </w:r>
+      <w:r>
+        <w:rPr>
+          <w:rFonts w:ascii="Times New Roman" w:hAnsi="Times New Roman" w:cs="Times New Roman"/>
+          <w:color w:val="000000"/>
+          <w:sz w:val="28"/>
+          <w:szCs w:val="28"/>
+          <w:shd w:val="clear" w:color="auto" w:fill="FFFFFF"/>
+        </w:rPr>
+        <w:t>лено</w:t>
+      </w:r>
+      <w:r>
+        <w:rPr>
+          <w:rFonts w:ascii="Times New Roman" w:hAnsi="Times New Roman" w:cs="Times New Roman"/>
+          <w:color w:val="000000"/>
+          <w:sz w:val="28"/>
+          <w:szCs w:val="28"/>
+          <w:shd w:val="clear" w:color="auto" w:fill="FFFFFF"/>
+        </w:rPr>
+        <w:t xml:space="preserve"> знання по використанню операторів множинного вибору, розгалуження та циклів при реалізації алгоритмів на мові програмування </w:t>
+      </w:r>
+      <w:r>
+        <w:rPr>
+          <w:rFonts w:ascii="Times New Roman" w:hAnsi="Times New Roman" w:cs="Times New Roman"/>
+          <w:color w:val="000000"/>
+          <w:sz w:val="28"/>
+          <w:szCs w:val="28"/>
+          <w:shd w:val="clear" w:color="auto" w:fill="FFFFFF"/>
+          <w:lang w:val="en-US"/>
+        </w:rPr>
+        <w:t>C#.</w:t>
+      </w:r>
+    </w:p>
+    <w:p/>
     <w:sectPr>
       <w:pgSz w:w="12240" w:h="15840"/>
       <w:pgMar w:top="1440" w:right="1440" w:bottom="1440" w:left="1440" w:header="708" w:footer="708" w:gutter="0"/>

</xml_diff>